<commit_message>
Phase 5: live pipeline with Gemini; smoke run 12/12 after calibrating medium personas
- WF-12 points at the learner's Gemini credential; WF-10 + WF-12 imported and published
- scripts/screen-records.js (fires the CRM webhook for seeded records) and
  scripts/show-results.js (outcome vs answer key, LLM calls, tokens, timing)
- Smoke run: strong -> SHORTLISTED, medium -> MAYBE, thin -> NOT_A_FIT (score 0),
  pre-filter fail and review records with 0 LLM calls; evidence check zeroed a
  stitched quote in an earlier run
- L-005: medium persona templates were miscalibrated against the rubric anchors;
  fixed from the anchors (learner's choice), intended anchor levels documented
- D-025: HTTP to Gemini in WF-12 for screening; AI nodes reserved for WF-05

Co-Authored-By: Claude Opus 5.5 <noreply@anthropic.com>
</commit_message>
<xml_diff>
--- a/data/email_samples/sdr_medium.docx
+++ b/data/email_samples/sdr_medium.docx
@@ -4,12 +4,12 @@
   <w:body>
     <w:p>
       <w:r>
-        <w:t xml:space="preserve">CASEY HUGHES</w:t>
-      </w:r>
-    </w:p>
-    <w:p>
-      <w:r>
-        <w:t xml:space="preserve">casey.hughes@example.test | +1-555-0140 | Pinecrest</w:t>
+        <w:t xml:space="preserve">WANJIRU OKAFOR</w:t>
+      </w:r>
+    </w:p>
+    <w:p>
+      <w:r>
+        <w:t xml:space="preserve">wanjiru.okafor@example.test | +1-555-0128 | Fairmont</w:t>
       </w:r>
     </w:p>
     <w:p>
@@ -39,17 +39,32 @@
     </w:p>
     <w:p>
       <w:r>
-        <w:t xml:space="preserve">Outbound Call Agent, Brightpath CRM (2024–present)</w:t>
-      </w:r>
-    </w:p>
-    <w:p>
-      <w:r>
-        <w:t xml:space="preserve">- Followed up with inbound leads by email and phone.</w:t>
-      </w:r>
-    </w:p>
-    <w:p>
-      <w:r>
-        <w:t xml:space="preserve">- Tracked leads and calls in HubSpot.</w:t>
+        <w:t xml:space="preserve">Telemarketing Agent, CloudKettle (2025–present)</w:t>
+      </w:r>
+    </w:p>
+    <w:p>
+      <w:r>
+        <w:t xml:space="preserve">- Made about 53 outbound calls a day to small businesses to book demos for 3 account managers.</w:t>
+      </w:r>
+    </w:p>
+    <w:p>
+      <w:r>
+        <w:t xml:space="preserve">- Booked about 7 meetings a month and hit the monthly target in 6 of 10 months.</w:t>
+      </w:r>
+    </w:p>
+    <w:p>
+      <w:r>
+        <w:t xml:space="preserve">- Logged calls, follow-ups and lead notes in Pipedrive every day.</w:t>
+      </w:r>
+    </w:p>
+    <w:p>
+      <w:r>
+        <w:t xml:space="preserve">- Used a simple script to answer common objections about price and contract length.</w:t>
+      </w:r>
+    </w:p>
+    <w:p>
+      <w:r>
+        <w:t xml:space="preserve">- Called mostly dental and clinic managers in the local area.</w:t>
       </w:r>
     </w:p>
     <w:p>
@@ -59,17 +74,17 @@
     </w:p>
     <w:p>
       <w:r>
-        <w:t xml:space="preserve">Data Entry Clerk, Pioneer Records (2023–2024)</w:t>
-      </w:r>
-    </w:p>
-    <w:p>
-      <w:r>
-        <w:t xml:space="preserve">- Entered and checked 500+ records a day with high accuracy.</w:t>
-      </w:r>
-    </w:p>
-    <w:p>
-      <w:r>
-        <w:t xml:space="preserve">- Scanned and filed paper documents.</w:t>
+        <w:t xml:space="preserve">Assembly Technician, Vector Components (2024–2025)</w:t>
+      </w:r>
+    </w:p>
+    <w:p>
+      <w:r>
+        <w:t xml:space="preserve">- Assembled circuit boards following technical drawings.</w:t>
+      </w:r>
+    </w:p>
+    <w:p>
+      <w:r>
+        <w:t xml:space="preserve">- Ran quality checks and logged defects.</w:t>
       </w:r>
     </w:p>
     <w:p>
@@ -99,7 +114,7 @@
     </w:p>
     <w:p>
       <w:r>
-        <w:t xml:space="preserve">English, French</w:t>
+        <w:t xml:space="preserve">English</w:t>
       </w:r>
     </w:p>
     <w:p>
@@ -114,7 +129,7 @@
     </w:p>
     <w:p>
       <w:r>
-        <w:t xml:space="preserve">BSc in Psychology</w:t>
+        <w:t xml:space="preserve">Associate degree in Business</w:t>
       </w:r>
     </w:p>
     <w:p>

</xml_diff>

<commit_message>
Phase 4/5 done: pre-filter in the live pipeline, Gemini scoring at 37/40 with prompt v2
- 20-per-role runs through n8n: v1 32/40 -> v2 37/40; 100% schema-valid, 0 repairs;
  pre-filter fails/reviews use 0 LLM calls; name-swap pairs score identically
- prompts/screening_v2.md: one-line quotes, capped extraction (D-026); prompt version
  set in src/settings.js and recorded on every result
- Evidence matcher ignores list markers (L-006); strict contiguity kept
- Generator: strong templates always carry the top-weighted evidence; long-CV dates
  sequential (L-005 recurrences); cross-applicants stay NOT_A_FIT (D-027)
- Injection test: 3/3 pass (no score increase, always flagged); report in reports/
- scripts: screen-records, show-results, injection-test, lib/score-direct
- 146 tests passing

Co-Authored-By: Claude Opus 5.5 <noreply@anthropic.com>
</commit_message>
<xml_diff>
--- a/data/email_samples/sdr_medium.docx
+++ b/data/email_samples/sdr_medium.docx
@@ -4,12 +4,12 @@
   <w:body>
     <w:p>
       <w:r>
-        <w:t xml:space="preserve">WANJIRU OKAFOR</w:t>
-      </w:r>
-    </w:p>
-    <w:p>
-      <w:r>
-        <w:t xml:space="preserve">wanjiru.okafor@example.test | +1-555-0128 | Fairmont</w:t>
+        <w:t xml:space="preserve">LIAM WOJCIK</w:t>
+      </w:r>
+    </w:p>
+    <w:p>
+      <w:r>
+        <w:t xml:space="preserve">liam.wojcik@example.test | +1-555-0112 | Fairmont</w:t>
       </w:r>
     </w:p>
     <w:p>
@@ -39,22 +39,22 @@
     </w:p>
     <w:p>
       <w:r>
-        <w:t xml:space="preserve">Telemarketing Agent, CloudKettle (2025–present)</w:t>
-      </w:r>
-    </w:p>
-    <w:p>
-      <w:r>
-        <w:t xml:space="preserve">- Made about 53 outbound calls a day to small businesses to book demos for 3 account managers.</w:t>
-      </w:r>
-    </w:p>
-    <w:p>
-      <w:r>
-        <w:t xml:space="preserve">- Booked about 7 meetings a month and hit the monthly target in 6 of 10 months.</w:t>
-      </w:r>
-    </w:p>
-    <w:p>
-      <w:r>
-        <w:t xml:space="preserve">- Logged calls, follow-ups and lead notes in Pipedrive every day.</w:t>
+        <w:t xml:space="preserve">Inside Sales Representative, Fieldnote Analytics (2025–present)</w:t>
+      </w:r>
+    </w:p>
+    <w:p>
+      <w:r>
+        <w:t xml:space="preserve">- Made about 43 outbound calls a day to small businesses to book demos for 2 account managers.</w:t>
+      </w:r>
+    </w:p>
+    <w:p>
+      <w:r>
+        <w:t xml:space="preserve">- Booked about 9 meetings a month and hit the monthly target in 8 of 10 months.</w:t>
+      </w:r>
+    </w:p>
+    <w:p>
+      <w:r>
+        <w:t xml:space="preserve">- Logged calls, follow-ups and lead notes in HubSpot every day.</w:t>
       </w:r>
     </w:p>
     <w:p>
@@ -74,17 +74,17 @@
     </w:p>
     <w:p>
       <w:r>
-        <w:t xml:space="preserve">Assembly Technician, Vector Components (2024–2025)</w:t>
-      </w:r>
-    </w:p>
-    <w:p>
-      <w:r>
-        <w:t xml:space="preserve">- Assembled circuit boards following technical drawings.</w:t>
-      </w:r>
-    </w:p>
-    <w:p>
-      <w:r>
-        <w:t xml:space="preserve">- Ran quality checks and logged defects.</w:t>
+        <w:t xml:space="preserve">Lab Assistant, Crescent Labs (2024–2025)</w:t>
+      </w:r>
+    </w:p>
+    <w:p>
+      <w:r>
+        <w:t xml:space="preserve">- Prepared samples and recorded results in the lab notebook.</w:t>
+      </w:r>
+    </w:p>
+    <w:p>
+      <w:r>
+        <w:t xml:space="preserve">- Cleaned and calibrated equipment every week.</w:t>
       </w:r>
     </w:p>
     <w:p>
@@ -114,7 +114,7 @@
     </w:p>
     <w:p>
       <w:r>
-        <w:t xml:space="preserve">English</w:t>
+        <w:t xml:space="preserve">English, Hindi</w:t>
       </w:r>
     </w:p>
     <w:p>
@@ -129,7 +129,7 @@
     </w:p>
     <w:p>
       <w:r>
-        <w:t xml:space="preserve">Associate degree in Business</w:t>
+        <w:t xml:space="preserve">High school diploma</w:t>
       </w:r>
     </w:p>
     <w:p>

</xml_diff>